<commit_message>
Update Autoevaluación de conceptos básicos del FIS de Sugeno.docx
</commit_message>
<xml_diff>
--- a/Sugeno/Autoevaluación de conceptos básicos del FIS de Sugeno.docx
+++ b/Sugeno/Autoevaluación de conceptos básicos del FIS de Sugeno.docx
@@ -31,8 +31,28 @@
           <w:b/>
           <w:bCs/>
         </w:rPr>
-        <w:t>SI x es mf1 ENTONCES y = 3x + 1</w:t>
+        <w:t xml:space="preserve">SI x es mf1 ENTONCES </w:t>
       </w:r>
+      <m:oMath>
+        <m:r>
+          <m:rPr>
+            <m:sty m:val="bi"/>
+          </m:rPr>
+          <w:rPr>
+            <w:rFonts w:ascii="Cambria Math" w:hAnsi="Cambria Math"/>
+          </w:rPr>
+          <m:t>y = 3</m:t>
+        </m:r>
+        <m:r>
+          <m:rPr>
+            <m:sty m:val="bi"/>
+          </m:rPr>
+          <w:rPr>
+            <w:rFonts w:ascii="Cambria Math" w:hAnsi="Cambria Math"/>
+          </w:rPr>
+          <m:t>x + 1</m:t>
+        </m:r>
+      </m:oMath>
     </w:p>
     <w:p>
       <w:pPr>
@@ -48,8 +68,28 @@
           <w:b/>
           <w:bCs/>
         </w:rPr>
-        <w:t xml:space="preserve">SI x es mf2 ENTONCES y = 3 </w:t>
+        <w:t xml:space="preserve">SI x es mf2 ENTONCES </w:t>
       </w:r>
+      <m:oMath>
+        <m:r>
+          <m:rPr>
+            <m:sty m:val="bi"/>
+          </m:rPr>
+          <w:rPr>
+            <w:rFonts w:ascii="Cambria Math" w:hAnsi="Cambria Math"/>
+          </w:rPr>
+          <m:t>y = 3-3</m:t>
+        </m:r>
+        <m:r>
+          <m:rPr>
+            <m:sty m:val="bi"/>
+          </m:rPr>
+          <w:rPr>
+            <w:rFonts w:ascii="Cambria Math" w:hAnsi="Cambria Math"/>
+          </w:rPr>
+          <m:t>x</m:t>
+        </m:r>
+      </m:oMath>
     </w:p>
     <w:p>
       <w:r>
@@ -522,6 +562,9 @@
         </mc:AlternateContent>
       </w:r>
       <w:r>
+        <w:rPr>
+          <w:noProof/>
+        </w:rPr>
         <w:drawing>
           <wp:inline distT="0" distB="0" distL="0" distR="0" wp14:anchorId="43AFB830" wp14:editId="52AA1B66">
             <wp:extent cx="5400040" cy="2072640"/>
@@ -1062,13 +1105,7 @@
                     <w:rPr>
                       <w:rFonts w:ascii="Cambria Math" w:hAnsi="Cambria Math"/>
                     </w:rPr>
-                    <m:t>2</m:t>
-                  </m:r>
-                  <m:r>
-                    <w:rPr>
-                      <w:rFonts w:ascii="Cambria Math" w:hAnsi="Cambria Math"/>
-                    </w:rPr>
-                    <m:t>μ</m:t>
+                    <m:t>2μ</m:t>
                   </m:r>
                 </m:e>
                 <m:sub>
@@ -1154,13 +1191,7 @@
                     <w:rPr>
                       <w:rFonts w:ascii="Cambria Math" w:hAnsi="Cambria Math"/>
                     </w:rPr>
-                    <m:t>2</m:t>
-                  </m:r>
-                  <m:r>
-                    <w:rPr>
-                      <w:rFonts w:ascii="Cambria Math" w:hAnsi="Cambria Math"/>
-                    </w:rPr>
-                    <m:t>μ</m:t>
+                    <m:t>2μ</m:t>
                   </m:r>
                 </m:e>
                 <m:sub>
@@ -1458,7 +1489,25 @@
                 <w:rPr>
                   <w:rFonts w:ascii="Cambria Math" w:hAnsi="Cambria Math"/>
                 </w:rPr>
-                <m:t>3∙5+1+2∙3</m:t>
+                <m:t>3∙5+1+2∙</m:t>
+              </m:r>
+              <m:r>
+                <w:rPr>
+                  <w:rFonts w:ascii="Cambria Math" w:hAnsi="Cambria Math"/>
+                </w:rPr>
+                <m:t>(</m:t>
+              </m:r>
+              <m:r>
+                <w:rPr>
+                  <w:rFonts w:ascii="Cambria Math" w:hAnsi="Cambria Math"/>
+                </w:rPr>
+                <m:t>3</m:t>
+              </m:r>
+              <m:r>
+                <w:rPr>
+                  <w:rFonts w:ascii="Cambria Math" w:hAnsi="Cambria Math"/>
+                </w:rPr>
+                <m:t>-3∙5)</m:t>
               </m:r>
             </m:num>
             <m:den>
@@ -1492,6 +1541,15 @@
             </w:rPr>
             <m:t>y=</m:t>
           </m:r>
+          <m:r>
+            <m:rPr>
+              <m:sty m:val="bi"/>
+            </m:rPr>
+            <w:rPr>
+              <w:rFonts w:ascii="Cambria Math" w:hAnsi="Cambria Math"/>
+            </w:rPr>
+            <m:t>-</m:t>
+          </m:r>
           <m:f>
             <m:fPr>
               <m:ctrlPr>
@@ -1511,7 +1569,7 @@
                 <w:rPr>
                   <w:rFonts w:ascii="Cambria Math" w:hAnsi="Cambria Math"/>
                 </w:rPr>
-                <m:t>22</m:t>
+                <m:t>8</m:t>
               </m:r>
             </m:num>
             <m:den>
@@ -1664,6 +1722,178 @@
                   </m:r>
                 </m:sub>
               </m:sSub>
+            </m:num>
+            <m:den>
+              <m:sSub>
+                <m:sSubPr>
+                  <m:ctrlPr>
+                    <w:rPr>
+                      <w:rFonts w:ascii="Cambria Math" w:hAnsi="Cambria Math"/>
+                      <w:i/>
+                    </w:rPr>
+                  </m:ctrlPr>
+                </m:sSubPr>
+                <m:e>
+                  <m:r>
+                    <w:rPr>
+                      <w:rFonts w:ascii="Cambria Math" w:hAnsi="Cambria Math"/>
+                    </w:rPr>
+                    <m:t>μ</m:t>
+                  </m:r>
+                </m:e>
+                <m:sub>
+                  <m:r>
+                    <w:rPr>
+                      <w:rFonts w:ascii="Cambria Math" w:hAnsi="Cambria Math"/>
+                    </w:rPr>
+                    <m:t>1</m:t>
+                  </m:r>
+                </m:sub>
+              </m:sSub>
+              <m:r>
+                <w:rPr>
+                  <w:rFonts w:ascii="Cambria Math" w:hAnsi="Cambria Math"/>
+                </w:rPr>
+                <m:t>+</m:t>
+              </m:r>
+              <m:sSub>
+                <m:sSubPr>
+                  <m:ctrlPr>
+                    <w:rPr>
+                      <w:rFonts w:ascii="Cambria Math" w:hAnsi="Cambria Math"/>
+                      <w:i/>
+                    </w:rPr>
+                  </m:ctrlPr>
+                </m:sSubPr>
+                <m:e>
+                  <m:r>
+                    <w:rPr>
+                      <w:rFonts w:ascii="Cambria Math" w:hAnsi="Cambria Math"/>
+                    </w:rPr>
+                    <m:t>μ</m:t>
+                  </m:r>
+                </m:e>
+                <m:sub>
+                  <m:r>
+                    <w:rPr>
+                      <w:rFonts w:ascii="Cambria Math" w:hAnsi="Cambria Math"/>
+                    </w:rPr>
+                    <m:t>2</m:t>
+                  </m:r>
+                </m:sub>
+              </m:sSub>
+            </m:den>
+          </m:f>
+          <m:r>
+            <w:rPr>
+              <w:rFonts w:ascii="Cambria Math" w:eastAsiaTheme="minorEastAsia" w:hAnsi="Cambria Math"/>
+            </w:rPr>
+            <m:t>=</m:t>
+          </m:r>
+          <m:f>
+            <m:fPr>
+              <m:ctrlPr>
+                <w:rPr>
+                  <w:rFonts w:ascii="Cambria Math" w:hAnsi="Cambria Math"/>
+                  <w:i/>
+                </w:rPr>
+              </m:ctrlPr>
+            </m:fPr>
+            <m:num>
+              <m:sSub>
+                <m:sSubPr>
+                  <m:ctrlPr>
+                    <w:rPr>
+                      <w:rFonts w:ascii="Cambria Math" w:hAnsi="Cambria Math"/>
+                      <w:i/>
+                    </w:rPr>
+                  </m:ctrlPr>
+                </m:sSubPr>
+                <m:e>
+                  <m:r>
+                    <w:rPr>
+                      <w:rFonts w:ascii="Cambria Math" w:hAnsi="Cambria Math"/>
+                    </w:rPr>
+                    <m:t>μ</m:t>
+                  </m:r>
+                </m:e>
+                <m:sub>
+                  <m:r>
+                    <w:rPr>
+                      <w:rFonts w:ascii="Cambria Math" w:hAnsi="Cambria Math"/>
+                    </w:rPr>
+                    <m:t>1</m:t>
+                  </m:r>
+                </m:sub>
+              </m:sSub>
+              <m:r>
+                <w:rPr>
+                  <w:rFonts w:ascii="Cambria Math" w:hAnsi="Cambria Math"/>
+                </w:rPr>
+                <m:t>(</m:t>
+              </m:r>
+              <m:r>
+                <w:rPr>
+                  <w:rFonts w:ascii="Cambria Math" w:hAnsi="Cambria Math"/>
+                </w:rPr>
+                <m:t>3x + 1</m:t>
+              </m:r>
+              <m:r>
+                <w:rPr>
+                  <w:rFonts w:ascii="Cambria Math" w:hAnsi="Cambria Math"/>
+                </w:rPr>
+                <m:t>)</m:t>
+              </m:r>
+              <m:r>
+                <w:rPr>
+                  <w:rFonts w:ascii="Cambria Math" w:hAnsi="Cambria Math"/>
+                </w:rPr>
+                <m:t>+</m:t>
+              </m:r>
+              <m:sSub>
+                <m:sSubPr>
+                  <m:ctrlPr>
+                    <w:rPr>
+                      <w:rFonts w:ascii="Cambria Math" w:hAnsi="Cambria Math"/>
+                      <w:i/>
+                    </w:rPr>
+                  </m:ctrlPr>
+                </m:sSubPr>
+                <m:e>
+                  <m:r>
+                    <w:rPr>
+                      <w:rFonts w:ascii="Cambria Math" w:hAnsi="Cambria Math"/>
+                    </w:rPr>
+                    <m:t>μ</m:t>
+                  </m:r>
+                </m:e>
+                <m:sub>
+                  <m:r>
+                    <w:rPr>
+                      <w:rFonts w:ascii="Cambria Math" w:hAnsi="Cambria Math"/>
+                    </w:rPr>
+                    <m:t>2</m:t>
+                  </m:r>
+                </m:sub>
+              </m:sSub>
+              <m:r>
+                <w:rPr>
+                  <w:rFonts w:ascii="Cambria Math" w:hAnsi="Cambria Math"/>
+                </w:rPr>
+                <m:t>(</m:t>
+              </m:r>
+              <m:r>
+                <w:rPr>
+                  <w:rFonts w:ascii="Cambria Math" w:hAnsi="Cambria Math"/>
+                </w:rPr>
+                <m:t>3-3x</m:t>
+              </m:r>
+              <m:r>
+                <w:rPr>
+                  <w:rFonts w:ascii="Cambria Math" w:hAnsi="Cambria Math"/>
+                </w:rPr>
+                <m:t>)</m:t>
+              </m:r>
             </m:num>
             <m:den>
               <m:sSub>
@@ -2343,6 +2573,7 @@
   <w:style w:type="character" w:default="1" w:styleId="Fuentedeprrafopredeter">
     <w:name w:val="Default Paragraph Font"/>
     <w:uiPriority w:val="1"/>
+    <w:semiHidden/>
     <w:unhideWhenUsed/>
   </w:style>
   <w:style w:type="table" w:default="1" w:styleId="Tablanormal">

</xml_diff>